<commit_message>
update: 기획서 양식 docx(ver.0.0.1) 갱신
Co-Authored-By: Claude Opus 4.8 (1M context) <noreply@anthropic.com>
</commit_message>
<xml_diff>
--- a/assets/무형문화유산 전승_기획서 양식_ver.0.0.1_20260713.docx
+++ b/assets/무형문화유산 전승_기획서 양식_ver.0.0.1_20260713.docx
@@ -880,12 +880,12 @@
             <w:fldChar w:fldCharType="begin"/>
           </w:r>
           <w:r>
-            <w:instrText xml:space="preserve"> TOC \o "2-3" \h \z \t "제목 1,1" </w:instrText>
+            <w:instrText xml:space="preserve"> TOC \o "2-2" \h \z \t "제목 1,1" </w:instrText>
           </w:r>
           <w:r>
             <w:fldChar w:fldCharType="separate"/>
           </w:r>
-          <w:hyperlink w:anchor="_Toc233892065" w:history="1">
+          <w:hyperlink w:anchor="_Toc234852306" w:history="1">
             <w:r>
               <w:rPr>
                 <w:rStyle w:val="af2"/>
@@ -928,7 +928,7 @@
                 <w:noProof/>
                 <w:webHidden/>
               </w:rPr>
-              <w:instrText xml:space="preserve"> PAGEREF _Toc233892065 \h </w:instrText>
+              <w:instrText xml:space="preserve"> PAGEREF _Toc234852306 \h </w:instrText>
             </w:r>
             <w:r>
               <w:rPr>
@@ -982,7 +982,7 @@
           <w:rFonts w:hint="eastAsia"/>
         </w:rPr>
       </w:pPr>
-      <w:bookmarkStart w:id="0" w:name="_Toc233892065"/>
+      <w:bookmarkStart w:id="0" w:name="_Toc234852306"/>
       <w:r>
         <w:rPr>
           <w:rFonts w:hint="eastAsia"/>
@@ -5082,7 +5082,7 @@
     <w:link w:val="1Char"/>
     <w:uiPriority w:val="9"/>
     <w:qFormat/>
-    <w:rsid w:val="00CC0586"/>
+    <w:rsid w:val="00DE05AB"/>
     <w:pPr>
       <w:keepNext/>
       <w:keepLines/>
@@ -5090,8 +5090,12 @@
         <w:numId w:val="1"/>
       </w:numPr>
       <w:pBdr>
-        <w:bottom w:val="single" w:sz="4" w:space="1" w:color="595959" w:themeColor="text1" w:themeTint="A6"/>
+        <w:top w:val="single" w:sz="24" w:space="1" w:color="5B9BD5" w:themeColor="accent1" w:shadow="1"/>
+        <w:left w:val="single" w:sz="24" w:space="4" w:color="5B9BD5" w:themeColor="accent1" w:shadow="1"/>
+        <w:bottom w:val="single" w:sz="24" w:space="1" w:color="5B9BD5" w:themeColor="accent1" w:shadow="1"/>
+        <w:right w:val="single" w:sz="24" w:space="4" w:color="5B9BD5" w:themeColor="accent1" w:shadow="1"/>
       </w:pBdr>
+      <w:shd w:val="clear" w:color="auto" w:fill="5B9BD5" w:themeFill="accent1"/>
       <w:spacing w:before="360"/>
       <w:outlineLvl w:val="0"/>
     </w:pPr>
@@ -5100,7 +5104,7 @@
       <w:b/>
       <w:bCs/>
       <w:smallCaps/>
-      <w:color w:val="000000" w:themeColor="text1"/>
+      <w:color w:val="FFFFFF" w:themeColor="background1"/>
       <w:sz w:val="36"/>
       <w:szCs w:val="36"/>
     </w:rPr>
@@ -5113,7 +5117,7 @@
     <w:uiPriority w:val="9"/>
     <w:unhideWhenUsed/>
     <w:qFormat/>
-    <w:rsid w:val="00F54EA8"/>
+    <w:rsid w:val="00403AB3"/>
     <w:pPr>
       <w:keepNext/>
       <w:keepLines/>
@@ -5121,6 +5125,9 @@
         <w:ilvl w:val="1"/>
         <w:numId w:val="1"/>
       </w:numPr>
+      <w:pBdr>
+        <w:bottom w:val="single" w:sz="2" w:space="1" w:color="auto"/>
+      </w:pBdr>
       <w:spacing w:before="360" w:after="0"/>
       <w:outlineLvl w:val="1"/>
     </w:pPr>
@@ -5356,15 +5363,16 @@
     <w:basedOn w:val="a0"/>
     <w:link w:val="1"/>
     <w:uiPriority w:val="9"/>
-    <w:rsid w:val="00CC0586"/>
+    <w:rsid w:val="00DE05AB"/>
     <w:rPr>
       <w:rFonts w:asciiTheme="majorHAnsi" w:eastAsiaTheme="majorEastAsia" w:hAnsiTheme="majorHAnsi" w:cstheme="majorBidi"/>
       <w:b/>
       <w:bCs/>
       <w:smallCaps/>
-      <w:color w:val="000000" w:themeColor="text1"/>
+      <w:color w:val="FFFFFF" w:themeColor="background1"/>
       <w:sz w:val="36"/>
       <w:szCs w:val="36"/>
+      <w:shd w:val="clear" w:color="auto" w:fill="5B9BD5" w:themeFill="accent1"/>
     </w:rPr>
   </w:style>
   <w:style w:type="character" w:customStyle="1" w:styleId="2Char">
@@ -5372,7 +5380,7 @@
     <w:basedOn w:val="a0"/>
     <w:link w:val="2"/>
     <w:uiPriority w:val="9"/>
-    <w:rsid w:val="00F54EA8"/>
+    <w:rsid w:val="00403AB3"/>
     <w:rPr>
       <w:rFonts w:asciiTheme="majorHAnsi" w:eastAsiaTheme="majorEastAsia" w:hAnsiTheme="majorHAnsi" w:cstheme="majorBidi"/>
       <w:b/>
@@ -6270,9 +6278,11 @@
     <w:rsid w:val="00A85B8B"/>
     <w:rsid w:val="00A86E7D"/>
     <w:rsid w:val="00B52619"/>
+    <w:rsid w:val="00BB36B5"/>
     <w:rsid w:val="00BF393E"/>
     <w:rsid w:val="00C56C69"/>
     <w:rsid w:val="00CB1EB3"/>
+    <w:rsid w:val="00D434E9"/>
     <w:rsid w:val="00D655CA"/>
     <w:rsid w:val="00D7729D"/>
     <w:rsid w:val="00E37FDA"/>

</xml_diff>